<commit_message>
Rebuild the results page around the study path; fix dropdown arrow
- Headline by score: 160+ hears "You're doing great work" with their
  LSAC percentile (2023-2026 table); below 160 starts with building the
  reasoning foundation (BYU, 7Sage, LSAT Lab, Blueprint, LawHub lessons)
- Path steps as expandable cards: practice questions (LawHub Advantage
  $124/yr, fee waiver, LSAT Demon, 7Sage, LSAT Lab, Leland, full courses),
  wrong answer journal, correcting your reasoning (explanations, AI with
  Gemini/Claude logos and the in-page tutor, coaching with Caleb), and a
  consistent schedule with calendar links
- Journal templates use research-backed fields
- Plans add a full timed practice test every week or two; below 160 the
  first weeks focus on fundamentals
- Custom select chevron sits 16px from the right edge

Co-Authored-By: Claude Opus 5.5 <noreply@anthropic.com>
Claude-Session: https://claude.ai/code/session_01GqEReuR2iVt7VfNpqWbcrn
</commit_message>
<xml_diff>
--- a/public/templates/lsat-wrong-answer-journal.docx
+++ b/public/templates/lsat-wrong-answer-journal.docx
@@ -40,7 +40,7 @@
         <w:pStyle w:val="ListNumber"/>
       </w:pPr>
       <w:r>
-        <w:t>Write why you picked your answer and why the right one is right. Ask AI if you are not sure.</w:t>
+        <w:t>Be honest about why your answer was tempting. That is the habit you are training out.</w:t>
       </w:r>
     </w:p>
     <w:p>
@@ -48,7 +48,15 @@
         <w:pStyle w:val="ListNumber"/>
       </w:pPr>
       <w:r>
-        <w:t>Review the journal once a week. Look for the mistakes that keep coming back, and drill those question types.</w:t>
+        <w:t>Write one rule for next time. Ask AI to explain the question if you are not sure why the right answer is right.</w:t>
+      </w:r>
+    </w:p>
+    <w:p>
+      <w:pPr>
+        <w:pStyle w:val="ListNumber"/>
+      </w:pPr>
+      <w:r>
+        <w:t>Redo each question a week later without looking at your notes. Review the journal every week and drill the question types that keep showing up.</w:t>
       </w:r>
     </w:p>
     <w:p>
@@ -113,7 +121,7 @@
                 <w:b/>
                 <w:sz w:val="20"/>
               </w:rPr>
-              <w:t>Test and question</w:t>
+              <w:t>The question (test, section, number)</w:t>
             </w:r>
           </w:p>
         </w:tc>
@@ -127,7 +135,7 @@
                 <w:color w:val="756B5B"/>
                 <w:sz w:val="20"/>
               </w:rPr>
-              <w:t>PT 141, LR 1, Q14</w:t>
+              <w:t>PT 141, LR section 1, question 14</w:t>
             </w:r>
           </w:p>
         </w:tc>
@@ -175,7 +183,7 @@
                 <w:b/>
                 <w:sz w:val="20"/>
               </w:rPr>
-              <w:t>My answer</w:t>
+              <w:t>My answer, and why I picked it</w:t>
             </w:r>
           </w:p>
         </w:tc>
@@ -189,7 +197,7 @@
                 <w:color w:val="756B5B"/>
                 <w:sz w:val="20"/>
               </w:rPr>
-              <w:t>B</w:t>
+              <w:t>B. It sounded like the argument's conclusion, so it felt safe.</w:t>
             </w:r>
           </w:p>
         </w:tc>
@@ -206,7 +214,7 @@
                 <w:b/>
                 <w:sz w:val="20"/>
               </w:rPr>
-              <w:t>Right answer</w:t>
+              <w:t>Right answer, and why it's right</w:t>
             </w:r>
           </w:p>
         </w:tc>
@@ -220,7 +228,7 @@
                 <w:color w:val="756B5B"/>
                 <w:sz w:val="20"/>
               </w:rPr>
-              <w:t>D</w:t>
+              <w:t>D. It names the mistake: the argument treats a correlation as a cause.</w:t>
             </w:r>
           </w:p>
         </w:tc>
@@ -237,7 +245,7 @@
                 <w:b/>
                 <w:sz w:val="20"/>
               </w:rPr>
-              <w:t>Why I missed it</w:t>
+              <w:t>What went wrong</w:t>
             </w:r>
           </w:p>
         </w:tc>
@@ -251,7 +259,7 @@
                 <w:color w:val="756B5B"/>
                 <w:sz w:val="20"/>
               </w:rPr>
-              <w:t>I picked an answer that described the argument instead of its mistake.</w:t>
+              <w:t>Fell for a trap. I picked an answer that described the argument instead of its flaw.</w:t>
             </w:r>
           </w:p>
         </w:tc>
@@ -268,7 +276,7 @@
                 <w:b/>
                 <w:sz w:val="20"/>
               </w:rPr>
-              <w:t>What to look for next time</w:t>
+              <w:t>How I'll get it right next time</w:t>
             </w:r>
           </w:p>
         </w:tc>
@@ -299,7 +307,7 @@
                 <w:b/>
                 <w:sz w:val="20"/>
               </w:rPr>
-              <w:t>Reviewed again?</w:t>
+              <w:t>Redid it? (date, right or wrong)</w:t>
             </w:r>
           </w:p>
         </w:tc>
@@ -313,7 +321,7 @@
                 <w:color w:val="756B5B"/>
                 <w:sz w:val="20"/>
               </w:rPr>
-              <w:t>Yes</w:t>
+              <w:t>Oct 19, right</w:t>
             </w:r>
           </w:p>
         </w:tc>
@@ -341,7 +349,7 @@
       </w:tblGrid>
       <w:tr>
         <w:trPr>
-          <w:trHeight w:val="461"/>
+          <w:trHeight w:val="504"/>
         </w:trPr>
         <w:tc>
           <w:tcPr>
@@ -365,6 +373,8 @@
           <w:p>
             <w:r>
               <w:rPr>
+                <w:i/>
+                <w:color w:val="756B5B"/>
                 <w:sz w:val="20"/>
               </w:rPr>
             </w:r>
@@ -373,7 +383,7 @@
       </w:tr>
       <w:tr>
         <w:trPr>
-          <w:trHeight w:val="461"/>
+          <w:trHeight w:val="2016"/>
         </w:trPr>
         <w:tc>
           <w:tcPr>
@@ -386,7 +396,7 @@
                 <w:b/>
                 <w:sz w:val="20"/>
               </w:rPr>
-              <w:t>Test and question</w:t>
+              <w:t>The question (test, section, number)</w:t>
             </w:r>
           </w:p>
         </w:tc>
@@ -397,15 +407,18 @@
           <w:p>
             <w:r>
               <w:rPr>
+                <w:i/>
+                <w:color w:val="756B5B"/>
                 <w:sz w:val="20"/>
               </w:rPr>
+              <w:t>Paste the question here or add a screenshot, so you can redo it later.</w:t>
             </w:r>
           </w:p>
         </w:tc>
       </w:tr>
       <w:tr>
         <w:trPr>
-          <w:trHeight w:val="461"/>
+          <w:trHeight w:val="504"/>
         </w:trPr>
         <w:tc>
           <w:tcPr>
@@ -429,70 +442,8 @@
           <w:p>
             <w:r>
               <w:rPr>
-                <w:sz w:val="20"/>
-              </w:rPr>
-            </w:r>
-          </w:p>
-        </w:tc>
-      </w:tr>
-      <w:tr>
-        <w:trPr>
-          <w:trHeight w:val="461"/>
-        </w:trPr>
-        <w:tc>
-          <w:tcPr>
-            <w:tcW w:type="dxa" w:w="2736"/>
-            <w:shd w:val="clear" w:color="auto" w:fill="EDE7D9"/>
-          </w:tcPr>
-          <w:p>
-            <w:r>
-              <w:rPr>
-                <w:b/>
-                <w:sz w:val="20"/>
-              </w:rPr>
-              <w:t>My answer</w:t>
-            </w:r>
-          </w:p>
-        </w:tc>
-        <w:tc>
-          <w:tcPr>
-            <w:tcW w:type="dxa" w:w="6624"/>
-          </w:tcPr>
-          <w:p>
-            <w:r>
-              <w:rPr>
-                <w:sz w:val="20"/>
-              </w:rPr>
-            </w:r>
-          </w:p>
-        </w:tc>
-      </w:tr>
-      <w:tr>
-        <w:trPr>
-          <w:trHeight w:val="461"/>
-        </w:trPr>
-        <w:tc>
-          <w:tcPr>
-            <w:tcW w:type="dxa" w:w="2736"/>
-            <w:shd w:val="clear" w:color="auto" w:fill="EDE7D9"/>
-          </w:tcPr>
-          <w:p>
-            <w:r>
-              <w:rPr>
-                <w:b/>
-                <w:sz w:val="20"/>
-              </w:rPr>
-              <w:t>Right answer</w:t>
-            </w:r>
-          </w:p>
-        </w:tc>
-        <w:tc>
-          <w:tcPr>
-            <w:tcW w:type="dxa" w:w="6624"/>
-          </w:tcPr>
-          <w:p>
-            <w:r>
-              <w:rPr>
+                <w:i/>
+                <w:color w:val="756B5B"/>
                 <w:sz w:val="20"/>
               </w:rPr>
             </w:r>
@@ -514,7 +465,7 @@
                 <w:b/>
                 <w:sz w:val="20"/>
               </w:rPr>
-              <w:t>Why I missed it</w:t>
+              <w:t>My answer, and why I picked it</w:t>
             </w:r>
           </w:p>
         </w:tc>
@@ -525,6 +476,8 @@
           <w:p>
             <w:r>
               <w:rPr>
+                <w:i/>
+                <w:color w:val="756B5B"/>
                 <w:sz w:val="20"/>
               </w:rPr>
             </w:r>
@@ -546,7 +499,7 @@
                 <w:b/>
                 <w:sz w:val="20"/>
               </w:rPr>
-              <w:t>What to look for next time</w:t>
+              <w:t>Right answer, and why it's right</w:t>
             </w:r>
           </w:p>
         </w:tc>
@@ -557,6 +510,8 @@
           <w:p>
             <w:r>
               <w:rPr>
+                <w:i/>
+                <w:color w:val="756B5B"/>
                 <w:sz w:val="20"/>
               </w:rPr>
             </w:r>
@@ -565,7 +520,7 @@
       </w:tr>
       <w:tr>
         <w:trPr>
-          <w:trHeight w:val="461"/>
+          <w:trHeight w:val="504"/>
         </w:trPr>
         <w:tc>
           <w:tcPr>
@@ -578,7 +533,7 @@
                 <w:b/>
                 <w:sz w:val="20"/>
               </w:rPr>
-              <w:t>Reviewed again?</w:t>
+              <w:t>What went wrong</w:t>
             </w:r>
           </w:p>
         </w:tc>
@@ -589,6 +544,77 @@
           <w:p>
             <w:r>
               <w:rPr>
+                <w:i/>
+                <w:color w:val="756B5B"/>
+                <w:sz w:val="20"/>
+              </w:rPr>
+              <w:t>Misread it, fell for a trap, missing a concept, or ran out of time?</w:t>
+            </w:r>
+          </w:p>
+        </w:tc>
+      </w:tr>
+      <w:tr>
+        <w:trPr>
+          <w:trHeight w:val="864"/>
+        </w:trPr>
+        <w:tc>
+          <w:tcPr>
+            <w:tcW w:type="dxa" w:w="2736"/>
+            <w:shd w:val="clear" w:color="auto" w:fill="EDE7D9"/>
+          </w:tcPr>
+          <w:p>
+            <w:r>
+              <w:rPr>
+                <w:b/>
+                <w:sz w:val="20"/>
+              </w:rPr>
+              <w:t>How I'll get it right next time</w:t>
+            </w:r>
+          </w:p>
+        </w:tc>
+        <w:tc>
+          <w:tcPr>
+            <w:tcW w:type="dxa" w:w="6624"/>
+          </w:tcPr>
+          <w:p>
+            <w:r>
+              <w:rPr>
+                <w:i/>
+                <w:color w:val="756B5B"/>
+                <w:sz w:val="20"/>
+              </w:rPr>
+            </w:r>
+          </w:p>
+        </w:tc>
+      </w:tr>
+      <w:tr>
+        <w:trPr>
+          <w:trHeight w:val="504"/>
+        </w:trPr>
+        <w:tc>
+          <w:tcPr>
+            <w:tcW w:type="dxa" w:w="2736"/>
+            <w:shd w:val="clear" w:color="auto" w:fill="EDE7D9"/>
+          </w:tcPr>
+          <w:p>
+            <w:r>
+              <w:rPr>
+                <w:b/>
+                <w:sz w:val="20"/>
+              </w:rPr>
+              <w:t>Redid it? (date, right or wrong)</w:t>
+            </w:r>
+          </w:p>
+        </w:tc>
+        <w:tc>
+          <w:tcPr>
+            <w:tcW w:type="dxa" w:w="6624"/>
+          </w:tcPr>
+          <w:p>
+            <w:r>
+              <w:rPr>
+                <w:i/>
+                <w:color w:val="756B5B"/>
                 <w:sz w:val="20"/>
               </w:rPr>
             </w:r>
@@ -610,7 +636,7 @@
       </w:tblGrid>
       <w:tr>
         <w:trPr>
-          <w:trHeight w:val="461"/>
+          <w:trHeight w:val="504"/>
         </w:trPr>
         <w:tc>
           <w:tcPr>
@@ -634,6 +660,8 @@
           <w:p>
             <w:r>
               <w:rPr>
+                <w:i/>
+                <w:color w:val="756B5B"/>
                 <w:sz w:val="20"/>
               </w:rPr>
             </w:r>
@@ -642,7 +670,7 @@
       </w:tr>
       <w:tr>
         <w:trPr>
-          <w:trHeight w:val="461"/>
+          <w:trHeight w:val="2016"/>
         </w:trPr>
         <w:tc>
           <w:tcPr>
@@ -655,7 +683,7 @@
                 <w:b/>
                 <w:sz w:val="20"/>
               </w:rPr>
-              <w:t>Test and question</w:t>
+              <w:t>The question (test, section, number)</w:t>
             </w:r>
           </w:p>
         </w:tc>
@@ -666,15 +694,18 @@
           <w:p>
             <w:r>
               <w:rPr>
+                <w:i/>
+                <w:color w:val="756B5B"/>
                 <w:sz w:val="20"/>
               </w:rPr>
+              <w:t>Paste the question here or add a screenshot, so you can redo it later.</w:t>
             </w:r>
           </w:p>
         </w:tc>
       </w:tr>
       <w:tr>
         <w:trPr>
-          <w:trHeight w:val="461"/>
+          <w:trHeight w:val="504"/>
         </w:trPr>
         <w:tc>
           <w:tcPr>
@@ -698,70 +729,8 @@
           <w:p>
             <w:r>
               <w:rPr>
-                <w:sz w:val="20"/>
-              </w:rPr>
-            </w:r>
-          </w:p>
-        </w:tc>
-      </w:tr>
-      <w:tr>
-        <w:trPr>
-          <w:trHeight w:val="461"/>
-        </w:trPr>
-        <w:tc>
-          <w:tcPr>
-            <w:tcW w:type="dxa" w:w="2736"/>
-            <w:shd w:val="clear" w:color="auto" w:fill="EDE7D9"/>
-          </w:tcPr>
-          <w:p>
-            <w:r>
-              <w:rPr>
-                <w:b/>
-                <w:sz w:val="20"/>
-              </w:rPr>
-              <w:t>My answer</w:t>
-            </w:r>
-          </w:p>
-        </w:tc>
-        <w:tc>
-          <w:tcPr>
-            <w:tcW w:type="dxa" w:w="6624"/>
-          </w:tcPr>
-          <w:p>
-            <w:r>
-              <w:rPr>
-                <w:sz w:val="20"/>
-              </w:rPr>
-            </w:r>
-          </w:p>
-        </w:tc>
-      </w:tr>
-      <w:tr>
-        <w:trPr>
-          <w:trHeight w:val="461"/>
-        </w:trPr>
-        <w:tc>
-          <w:tcPr>
-            <w:tcW w:type="dxa" w:w="2736"/>
-            <w:shd w:val="clear" w:color="auto" w:fill="EDE7D9"/>
-          </w:tcPr>
-          <w:p>
-            <w:r>
-              <w:rPr>
-                <w:b/>
-                <w:sz w:val="20"/>
-              </w:rPr>
-              <w:t>Right answer</w:t>
-            </w:r>
-          </w:p>
-        </w:tc>
-        <w:tc>
-          <w:tcPr>
-            <w:tcW w:type="dxa" w:w="6624"/>
-          </w:tcPr>
-          <w:p>
-            <w:r>
-              <w:rPr>
+                <w:i/>
+                <w:color w:val="756B5B"/>
                 <w:sz w:val="20"/>
               </w:rPr>
             </w:r>
@@ -783,7 +752,7 @@
                 <w:b/>
                 <w:sz w:val="20"/>
               </w:rPr>
-              <w:t>Why I missed it</w:t>
+              <w:t>My answer, and why I picked it</w:t>
             </w:r>
           </w:p>
         </w:tc>
@@ -794,6 +763,8 @@
           <w:p>
             <w:r>
               <w:rPr>
+                <w:i/>
+                <w:color w:val="756B5B"/>
                 <w:sz w:val="20"/>
               </w:rPr>
             </w:r>
@@ -815,7 +786,7 @@
                 <w:b/>
                 <w:sz w:val="20"/>
               </w:rPr>
-              <w:t>What to look for next time</w:t>
+              <w:t>Right answer, and why it's right</w:t>
             </w:r>
           </w:p>
         </w:tc>
@@ -826,6 +797,8 @@
           <w:p>
             <w:r>
               <w:rPr>
+                <w:i/>
+                <w:color w:val="756B5B"/>
                 <w:sz w:val="20"/>
               </w:rPr>
             </w:r>
@@ -834,7 +807,7 @@
       </w:tr>
       <w:tr>
         <w:trPr>
-          <w:trHeight w:val="461"/>
+          <w:trHeight w:val="504"/>
         </w:trPr>
         <w:tc>
           <w:tcPr>
@@ -847,7 +820,7 @@
                 <w:b/>
                 <w:sz w:val="20"/>
               </w:rPr>
-              <w:t>Reviewed again?</w:t>
+              <w:t>What went wrong</w:t>
             </w:r>
           </w:p>
         </w:tc>
@@ -858,6 +831,77 @@
           <w:p>
             <w:r>
               <w:rPr>
+                <w:i/>
+                <w:color w:val="756B5B"/>
+                <w:sz w:val="20"/>
+              </w:rPr>
+              <w:t>Misread it, fell for a trap, missing a concept, or ran out of time?</w:t>
+            </w:r>
+          </w:p>
+        </w:tc>
+      </w:tr>
+      <w:tr>
+        <w:trPr>
+          <w:trHeight w:val="864"/>
+        </w:trPr>
+        <w:tc>
+          <w:tcPr>
+            <w:tcW w:type="dxa" w:w="2736"/>
+            <w:shd w:val="clear" w:color="auto" w:fill="EDE7D9"/>
+          </w:tcPr>
+          <w:p>
+            <w:r>
+              <w:rPr>
+                <w:b/>
+                <w:sz w:val="20"/>
+              </w:rPr>
+              <w:t>How I'll get it right next time</w:t>
+            </w:r>
+          </w:p>
+        </w:tc>
+        <w:tc>
+          <w:tcPr>
+            <w:tcW w:type="dxa" w:w="6624"/>
+          </w:tcPr>
+          <w:p>
+            <w:r>
+              <w:rPr>
+                <w:i/>
+                <w:color w:val="756B5B"/>
+                <w:sz w:val="20"/>
+              </w:rPr>
+            </w:r>
+          </w:p>
+        </w:tc>
+      </w:tr>
+      <w:tr>
+        <w:trPr>
+          <w:trHeight w:val="504"/>
+        </w:trPr>
+        <w:tc>
+          <w:tcPr>
+            <w:tcW w:type="dxa" w:w="2736"/>
+            <w:shd w:val="clear" w:color="auto" w:fill="EDE7D9"/>
+          </w:tcPr>
+          <w:p>
+            <w:r>
+              <w:rPr>
+                <w:b/>
+                <w:sz w:val="20"/>
+              </w:rPr>
+              <w:t>Redid it? (date, right or wrong)</w:t>
+            </w:r>
+          </w:p>
+        </w:tc>
+        <w:tc>
+          <w:tcPr>
+            <w:tcW w:type="dxa" w:w="6624"/>
+          </w:tcPr>
+          <w:p>
+            <w:r>
+              <w:rPr>
+                <w:i/>
+                <w:color w:val="756B5B"/>
                 <w:sz w:val="20"/>
               </w:rPr>
             </w:r>
@@ -879,7 +923,7 @@
       </w:tblGrid>
       <w:tr>
         <w:trPr>
-          <w:trHeight w:val="461"/>
+          <w:trHeight w:val="504"/>
         </w:trPr>
         <w:tc>
           <w:tcPr>
@@ -903,6 +947,8 @@
           <w:p>
             <w:r>
               <w:rPr>
+                <w:i/>
+                <w:color w:val="756B5B"/>
                 <w:sz w:val="20"/>
               </w:rPr>
             </w:r>
@@ -911,7 +957,7 @@
       </w:tr>
       <w:tr>
         <w:trPr>
-          <w:trHeight w:val="461"/>
+          <w:trHeight w:val="2016"/>
         </w:trPr>
         <w:tc>
           <w:tcPr>
@@ -924,7 +970,7 @@
                 <w:b/>
                 <w:sz w:val="20"/>
               </w:rPr>
-              <w:t>Test and question</w:t>
+              <w:t>The question (test, section, number)</w:t>
             </w:r>
           </w:p>
         </w:tc>
@@ -935,15 +981,18 @@
           <w:p>
             <w:r>
               <w:rPr>
+                <w:i/>
+                <w:color w:val="756B5B"/>
                 <w:sz w:val="20"/>
               </w:rPr>
+              <w:t>Paste the question here or add a screenshot, so you can redo it later.</w:t>
             </w:r>
           </w:p>
         </w:tc>
       </w:tr>
       <w:tr>
         <w:trPr>
-          <w:trHeight w:val="461"/>
+          <w:trHeight w:val="504"/>
         </w:trPr>
         <w:tc>
           <w:tcPr>
@@ -967,70 +1016,8 @@
           <w:p>
             <w:r>
               <w:rPr>
-                <w:sz w:val="20"/>
-              </w:rPr>
-            </w:r>
-          </w:p>
-        </w:tc>
-      </w:tr>
-      <w:tr>
-        <w:trPr>
-          <w:trHeight w:val="461"/>
-        </w:trPr>
-        <w:tc>
-          <w:tcPr>
-            <w:tcW w:type="dxa" w:w="2736"/>
-            <w:shd w:val="clear" w:color="auto" w:fill="EDE7D9"/>
-          </w:tcPr>
-          <w:p>
-            <w:r>
-              <w:rPr>
-                <w:b/>
-                <w:sz w:val="20"/>
-              </w:rPr>
-              <w:t>My answer</w:t>
-            </w:r>
-          </w:p>
-        </w:tc>
-        <w:tc>
-          <w:tcPr>
-            <w:tcW w:type="dxa" w:w="6624"/>
-          </w:tcPr>
-          <w:p>
-            <w:r>
-              <w:rPr>
-                <w:sz w:val="20"/>
-              </w:rPr>
-            </w:r>
-          </w:p>
-        </w:tc>
-      </w:tr>
-      <w:tr>
-        <w:trPr>
-          <w:trHeight w:val="461"/>
-        </w:trPr>
-        <w:tc>
-          <w:tcPr>
-            <w:tcW w:type="dxa" w:w="2736"/>
-            <w:shd w:val="clear" w:color="auto" w:fill="EDE7D9"/>
-          </w:tcPr>
-          <w:p>
-            <w:r>
-              <w:rPr>
-                <w:b/>
-                <w:sz w:val="20"/>
-              </w:rPr>
-              <w:t>Right answer</w:t>
-            </w:r>
-          </w:p>
-        </w:tc>
-        <w:tc>
-          <w:tcPr>
-            <w:tcW w:type="dxa" w:w="6624"/>
-          </w:tcPr>
-          <w:p>
-            <w:r>
-              <w:rPr>
+                <w:i/>
+                <w:color w:val="756B5B"/>
                 <w:sz w:val="20"/>
               </w:rPr>
             </w:r>
@@ -1052,7 +1039,7 @@
                 <w:b/>
                 <w:sz w:val="20"/>
               </w:rPr>
-              <w:t>Why I missed it</w:t>
+              <w:t>My answer, and why I picked it</w:t>
             </w:r>
           </w:p>
         </w:tc>
@@ -1063,6 +1050,8 @@
           <w:p>
             <w:r>
               <w:rPr>
+                <w:i/>
+                <w:color w:val="756B5B"/>
                 <w:sz w:val="20"/>
               </w:rPr>
             </w:r>
@@ -1084,7 +1073,7 @@
                 <w:b/>
                 <w:sz w:val="20"/>
               </w:rPr>
-              <w:t>What to look for next time</w:t>
+              <w:t>Right answer, and why it's right</w:t>
             </w:r>
           </w:p>
         </w:tc>
@@ -1095,6 +1084,8 @@
           <w:p>
             <w:r>
               <w:rPr>
+                <w:i/>
+                <w:color w:val="756B5B"/>
                 <w:sz w:val="20"/>
               </w:rPr>
             </w:r>
@@ -1103,7 +1094,7 @@
       </w:tr>
       <w:tr>
         <w:trPr>
-          <w:trHeight w:val="461"/>
+          <w:trHeight w:val="504"/>
         </w:trPr>
         <w:tc>
           <w:tcPr>
@@ -1116,7 +1107,7 @@
                 <w:b/>
                 <w:sz w:val="20"/>
               </w:rPr>
-              <w:t>Reviewed again?</w:t>
+              <w:t>What went wrong</w:t>
             </w:r>
           </w:p>
         </w:tc>
@@ -1127,6 +1118,77 @@
           <w:p>
             <w:r>
               <w:rPr>
+                <w:i/>
+                <w:color w:val="756B5B"/>
+                <w:sz w:val="20"/>
+              </w:rPr>
+              <w:t>Misread it, fell for a trap, missing a concept, or ran out of time?</w:t>
+            </w:r>
+          </w:p>
+        </w:tc>
+      </w:tr>
+      <w:tr>
+        <w:trPr>
+          <w:trHeight w:val="864"/>
+        </w:trPr>
+        <w:tc>
+          <w:tcPr>
+            <w:tcW w:type="dxa" w:w="2736"/>
+            <w:shd w:val="clear" w:color="auto" w:fill="EDE7D9"/>
+          </w:tcPr>
+          <w:p>
+            <w:r>
+              <w:rPr>
+                <w:b/>
+                <w:sz w:val="20"/>
+              </w:rPr>
+              <w:t>How I'll get it right next time</w:t>
+            </w:r>
+          </w:p>
+        </w:tc>
+        <w:tc>
+          <w:tcPr>
+            <w:tcW w:type="dxa" w:w="6624"/>
+          </w:tcPr>
+          <w:p>
+            <w:r>
+              <w:rPr>
+                <w:i/>
+                <w:color w:val="756B5B"/>
+                <w:sz w:val="20"/>
+              </w:rPr>
+            </w:r>
+          </w:p>
+        </w:tc>
+      </w:tr>
+      <w:tr>
+        <w:trPr>
+          <w:trHeight w:val="504"/>
+        </w:trPr>
+        <w:tc>
+          <w:tcPr>
+            <w:tcW w:type="dxa" w:w="2736"/>
+            <w:shd w:val="clear" w:color="auto" w:fill="EDE7D9"/>
+          </w:tcPr>
+          <w:p>
+            <w:r>
+              <w:rPr>
+                <w:b/>
+                <w:sz w:val="20"/>
+              </w:rPr>
+              <w:t>Redid it? (date, right or wrong)</w:t>
+            </w:r>
+          </w:p>
+        </w:tc>
+        <w:tc>
+          <w:tcPr>
+            <w:tcW w:type="dxa" w:w="6624"/>
+          </w:tcPr>
+          <w:p>
+            <w:r>
+              <w:rPr>
+                <w:i/>
+                <w:color w:val="756B5B"/>
                 <w:sz w:val="20"/>
               </w:rPr>
             </w:r>
@@ -1148,7 +1210,7 @@
       </w:tblGrid>
       <w:tr>
         <w:trPr>
-          <w:trHeight w:val="461"/>
+          <w:trHeight w:val="504"/>
         </w:trPr>
         <w:tc>
           <w:tcPr>
@@ -1172,6 +1234,8 @@
           <w:p>
             <w:r>
               <w:rPr>
+                <w:i/>
+                <w:color w:val="756B5B"/>
                 <w:sz w:val="20"/>
               </w:rPr>
             </w:r>
@@ -1180,7 +1244,7 @@
       </w:tr>
       <w:tr>
         <w:trPr>
-          <w:trHeight w:val="461"/>
+          <w:trHeight w:val="2016"/>
         </w:trPr>
         <w:tc>
           <w:tcPr>
@@ -1193,7 +1257,7 @@
                 <w:b/>
                 <w:sz w:val="20"/>
               </w:rPr>
-              <w:t>Test and question</w:t>
+              <w:t>The question (test, section, number)</w:t>
             </w:r>
           </w:p>
         </w:tc>
@@ -1204,15 +1268,18 @@
           <w:p>
             <w:r>
               <w:rPr>
+                <w:i/>
+                <w:color w:val="756B5B"/>
                 <w:sz w:val="20"/>
               </w:rPr>
+              <w:t>Paste the question here or add a screenshot, so you can redo it later.</w:t>
             </w:r>
           </w:p>
         </w:tc>
       </w:tr>
       <w:tr>
         <w:trPr>
-          <w:trHeight w:val="461"/>
+          <w:trHeight w:val="504"/>
         </w:trPr>
         <w:tc>
           <w:tcPr>
@@ -1236,70 +1303,8 @@
           <w:p>
             <w:r>
               <w:rPr>
-                <w:sz w:val="20"/>
-              </w:rPr>
-            </w:r>
-          </w:p>
-        </w:tc>
-      </w:tr>
-      <w:tr>
-        <w:trPr>
-          <w:trHeight w:val="461"/>
-        </w:trPr>
-        <w:tc>
-          <w:tcPr>
-            <w:tcW w:type="dxa" w:w="2736"/>
-            <w:shd w:val="clear" w:color="auto" w:fill="EDE7D9"/>
-          </w:tcPr>
-          <w:p>
-            <w:r>
-              <w:rPr>
-                <w:b/>
-                <w:sz w:val="20"/>
-              </w:rPr>
-              <w:t>My answer</w:t>
-            </w:r>
-          </w:p>
-        </w:tc>
-        <w:tc>
-          <w:tcPr>
-            <w:tcW w:type="dxa" w:w="6624"/>
-          </w:tcPr>
-          <w:p>
-            <w:r>
-              <w:rPr>
-                <w:sz w:val="20"/>
-              </w:rPr>
-            </w:r>
-          </w:p>
-        </w:tc>
-      </w:tr>
-      <w:tr>
-        <w:trPr>
-          <w:trHeight w:val="461"/>
-        </w:trPr>
-        <w:tc>
-          <w:tcPr>
-            <w:tcW w:type="dxa" w:w="2736"/>
-            <w:shd w:val="clear" w:color="auto" w:fill="EDE7D9"/>
-          </w:tcPr>
-          <w:p>
-            <w:r>
-              <w:rPr>
-                <w:b/>
-                <w:sz w:val="20"/>
-              </w:rPr>
-              <w:t>Right answer</w:t>
-            </w:r>
-          </w:p>
-        </w:tc>
-        <w:tc>
-          <w:tcPr>
-            <w:tcW w:type="dxa" w:w="6624"/>
-          </w:tcPr>
-          <w:p>
-            <w:r>
-              <w:rPr>
+                <w:i/>
+                <w:color w:val="756B5B"/>
                 <w:sz w:val="20"/>
               </w:rPr>
             </w:r>
@@ -1321,7 +1326,7 @@
                 <w:b/>
                 <w:sz w:val="20"/>
               </w:rPr>
-              <w:t>Why I missed it</w:t>
+              <w:t>My answer, and why I picked it</w:t>
             </w:r>
           </w:p>
         </w:tc>
@@ -1332,6 +1337,8 @@
           <w:p>
             <w:r>
               <w:rPr>
+                <w:i/>
+                <w:color w:val="756B5B"/>
                 <w:sz w:val="20"/>
               </w:rPr>
             </w:r>
@@ -1353,7 +1360,7 @@
                 <w:b/>
                 <w:sz w:val="20"/>
               </w:rPr>
-              <w:t>What to look for next time</w:t>
+              <w:t>Right answer, and why it's right</w:t>
             </w:r>
           </w:p>
         </w:tc>
@@ -1364,6 +1371,8 @@
           <w:p>
             <w:r>
               <w:rPr>
+                <w:i/>
+                <w:color w:val="756B5B"/>
                 <w:sz w:val="20"/>
               </w:rPr>
             </w:r>
@@ -1372,7 +1381,7 @@
       </w:tr>
       <w:tr>
         <w:trPr>
-          <w:trHeight w:val="461"/>
+          <w:trHeight w:val="504"/>
         </w:trPr>
         <w:tc>
           <w:tcPr>
@@ -1385,7 +1394,7 @@
                 <w:b/>
                 <w:sz w:val="20"/>
               </w:rPr>
-              <w:t>Reviewed again?</w:t>
+              <w:t>What went wrong</w:t>
             </w:r>
           </w:p>
         </w:tc>
@@ -1396,6 +1405,77 @@
           <w:p>
             <w:r>
               <w:rPr>
+                <w:i/>
+                <w:color w:val="756B5B"/>
+                <w:sz w:val="20"/>
+              </w:rPr>
+              <w:t>Misread it, fell for a trap, missing a concept, or ran out of time?</w:t>
+            </w:r>
+          </w:p>
+        </w:tc>
+      </w:tr>
+      <w:tr>
+        <w:trPr>
+          <w:trHeight w:val="864"/>
+        </w:trPr>
+        <w:tc>
+          <w:tcPr>
+            <w:tcW w:type="dxa" w:w="2736"/>
+            <w:shd w:val="clear" w:color="auto" w:fill="EDE7D9"/>
+          </w:tcPr>
+          <w:p>
+            <w:r>
+              <w:rPr>
+                <w:b/>
+                <w:sz w:val="20"/>
+              </w:rPr>
+              <w:t>How I'll get it right next time</w:t>
+            </w:r>
+          </w:p>
+        </w:tc>
+        <w:tc>
+          <w:tcPr>
+            <w:tcW w:type="dxa" w:w="6624"/>
+          </w:tcPr>
+          <w:p>
+            <w:r>
+              <w:rPr>
+                <w:i/>
+                <w:color w:val="756B5B"/>
+                <w:sz w:val="20"/>
+              </w:rPr>
+            </w:r>
+          </w:p>
+        </w:tc>
+      </w:tr>
+      <w:tr>
+        <w:trPr>
+          <w:trHeight w:val="504"/>
+        </w:trPr>
+        <w:tc>
+          <w:tcPr>
+            <w:tcW w:type="dxa" w:w="2736"/>
+            <w:shd w:val="clear" w:color="auto" w:fill="EDE7D9"/>
+          </w:tcPr>
+          <w:p>
+            <w:r>
+              <w:rPr>
+                <w:b/>
+                <w:sz w:val="20"/>
+              </w:rPr>
+              <w:t>Redid it? (date, right or wrong)</w:t>
+            </w:r>
+          </w:p>
+        </w:tc>
+        <w:tc>
+          <w:tcPr>
+            <w:tcW w:type="dxa" w:w="6624"/>
+          </w:tcPr>
+          <w:p>
+            <w:r>
+              <w:rPr>
+                <w:i/>
+                <w:color w:val="756B5B"/>
                 <w:sz w:val="20"/>
               </w:rPr>
             </w:r>
@@ -1417,7 +1497,7 @@
       </w:tblGrid>
       <w:tr>
         <w:trPr>
-          <w:trHeight w:val="461"/>
+          <w:trHeight w:val="504"/>
         </w:trPr>
         <w:tc>
           <w:tcPr>
@@ -1441,6 +1521,8 @@
           <w:p>
             <w:r>
               <w:rPr>
+                <w:i/>
+                <w:color w:val="756B5B"/>
                 <w:sz w:val="20"/>
               </w:rPr>
             </w:r>
@@ -1449,7 +1531,7 @@
       </w:tr>
       <w:tr>
         <w:trPr>
-          <w:trHeight w:val="461"/>
+          <w:trHeight w:val="2016"/>
         </w:trPr>
         <w:tc>
           <w:tcPr>
@@ -1462,7 +1544,7 @@
                 <w:b/>
                 <w:sz w:val="20"/>
               </w:rPr>
-              <w:t>Test and question</w:t>
+              <w:t>The question (test, section, number)</w:t>
             </w:r>
           </w:p>
         </w:tc>
@@ -1473,15 +1555,18 @@
           <w:p>
             <w:r>
               <w:rPr>
+                <w:i/>
+                <w:color w:val="756B5B"/>
                 <w:sz w:val="20"/>
               </w:rPr>
+              <w:t>Paste the question here or add a screenshot, so you can redo it later.</w:t>
             </w:r>
           </w:p>
         </w:tc>
       </w:tr>
       <w:tr>
         <w:trPr>
-          <w:trHeight w:val="461"/>
+          <w:trHeight w:val="504"/>
         </w:trPr>
         <w:tc>
           <w:tcPr>
@@ -1505,70 +1590,8 @@
           <w:p>
             <w:r>
               <w:rPr>
-                <w:sz w:val="20"/>
-              </w:rPr>
-            </w:r>
-          </w:p>
-        </w:tc>
-      </w:tr>
-      <w:tr>
-        <w:trPr>
-          <w:trHeight w:val="461"/>
-        </w:trPr>
-        <w:tc>
-          <w:tcPr>
-            <w:tcW w:type="dxa" w:w="2736"/>
-            <w:shd w:val="clear" w:color="auto" w:fill="EDE7D9"/>
-          </w:tcPr>
-          <w:p>
-            <w:r>
-              <w:rPr>
-                <w:b/>
-                <w:sz w:val="20"/>
-              </w:rPr>
-              <w:t>My answer</w:t>
-            </w:r>
-          </w:p>
-        </w:tc>
-        <w:tc>
-          <w:tcPr>
-            <w:tcW w:type="dxa" w:w="6624"/>
-          </w:tcPr>
-          <w:p>
-            <w:r>
-              <w:rPr>
-                <w:sz w:val="20"/>
-              </w:rPr>
-            </w:r>
-          </w:p>
-        </w:tc>
-      </w:tr>
-      <w:tr>
-        <w:trPr>
-          <w:trHeight w:val="461"/>
-        </w:trPr>
-        <w:tc>
-          <w:tcPr>
-            <w:tcW w:type="dxa" w:w="2736"/>
-            <w:shd w:val="clear" w:color="auto" w:fill="EDE7D9"/>
-          </w:tcPr>
-          <w:p>
-            <w:r>
-              <w:rPr>
-                <w:b/>
-                <w:sz w:val="20"/>
-              </w:rPr>
-              <w:t>Right answer</w:t>
-            </w:r>
-          </w:p>
-        </w:tc>
-        <w:tc>
-          <w:tcPr>
-            <w:tcW w:type="dxa" w:w="6624"/>
-          </w:tcPr>
-          <w:p>
-            <w:r>
-              <w:rPr>
+                <w:i/>
+                <w:color w:val="756B5B"/>
                 <w:sz w:val="20"/>
               </w:rPr>
             </w:r>
@@ -1590,7 +1613,7 @@
                 <w:b/>
                 <w:sz w:val="20"/>
               </w:rPr>
-              <w:t>Why I missed it</w:t>
+              <w:t>My answer, and why I picked it</w:t>
             </w:r>
           </w:p>
         </w:tc>
@@ -1601,6 +1624,8 @@
           <w:p>
             <w:r>
               <w:rPr>
+                <w:i/>
+                <w:color w:val="756B5B"/>
                 <w:sz w:val="20"/>
               </w:rPr>
             </w:r>
@@ -1622,7 +1647,7 @@
                 <w:b/>
                 <w:sz w:val="20"/>
               </w:rPr>
-              <w:t>What to look for next time</w:t>
+              <w:t>Right answer, and why it's right</w:t>
             </w:r>
           </w:p>
         </w:tc>
@@ -1633,6 +1658,8 @@
           <w:p>
             <w:r>
               <w:rPr>
+                <w:i/>
+                <w:color w:val="756B5B"/>
                 <w:sz w:val="20"/>
               </w:rPr>
             </w:r>
@@ -1641,7 +1668,7 @@
       </w:tr>
       <w:tr>
         <w:trPr>
-          <w:trHeight w:val="461"/>
+          <w:trHeight w:val="504"/>
         </w:trPr>
         <w:tc>
           <w:tcPr>
@@ -1654,7 +1681,7 @@
                 <w:b/>
                 <w:sz w:val="20"/>
               </w:rPr>
-              <w:t>Reviewed again?</w:t>
+              <w:t>What went wrong</w:t>
             </w:r>
           </w:p>
         </w:tc>
@@ -1665,6 +1692,77 @@
           <w:p>
             <w:r>
               <w:rPr>
+                <w:i/>
+                <w:color w:val="756B5B"/>
+                <w:sz w:val="20"/>
+              </w:rPr>
+              <w:t>Misread it, fell for a trap, missing a concept, or ran out of time?</w:t>
+            </w:r>
+          </w:p>
+        </w:tc>
+      </w:tr>
+      <w:tr>
+        <w:trPr>
+          <w:trHeight w:val="864"/>
+        </w:trPr>
+        <w:tc>
+          <w:tcPr>
+            <w:tcW w:type="dxa" w:w="2736"/>
+            <w:shd w:val="clear" w:color="auto" w:fill="EDE7D9"/>
+          </w:tcPr>
+          <w:p>
+            <w:r>
+              <w:rPr>
+                <w:b/>
+                <w:sz w:val="20"/>
+              </w:rPr>
+              <w:t>How I'll get it right next time</w:t>
+            </w:r>
+          </w:p>
+        </w:tc>
+        <w:tc>
+          <w:tcPr>
+            <w:tcW w:type="dxa" w:w="6624"/>
+          </w:tcPr>
+          <w:p>
+            <w:r>
+              <w:rPr>
+                <w:i/>
+                <w:color w:val="756B5B"/>
+                <w:sz w:val="20"/>
+              </w:rPr>
+            </w:r>
+          </w:p>
+        </w:tc>
+      </w:tr>
+      <w:tr>
+        <w:trPr>
+          <w:trHeight w:val="504"/>
+        </w:trPr>
+        <w:tc>
+          <w:tcPr>
+            <w:tcW w:type="dxa" w:w="2736"/>
+            <w:shd w:val="clear" w:color="auto" w:fill="EDE7D9"/>
+          </w:tcPr>
+          <w:p>
+            <w:r>
+              <w:rPr>
+                <w:b/>
+                <w:sz w:val="20"/>
+              </w:rPr>
+              <w:t>Redid it? (date, right or wrong)</w:t>
+            </w:r>
+          </w:p>
+        </w:tc>
+        <w:tc>
+          <w:tcPr>
+            <w:tcW w:type="dxa" w:w="6624"/>
+          </w:tcPr>
+          <w:p>
+            <w:r>
+              <w:rPr>
+                <w:i/>
+                <w:color w:val="756B5B"/>
                 <w:sz w:val="20"/>
               </w:rPr>
             </w:r>
@@ -1686,7 +1784,7 @@
       </w:tblGrid>
       <w:tr>
         <w:trPr>
-          <w:trHeight w:val="461"/>
+          <w:trHeight w:val="504"/>
         </w:trPr>
         <w:tc>
           <w:tcPr>
@@ -1710,6 +1808,8 @@
           <w:p>
             <w:r>
               <w:rPr>
+                <w:i/>
+                <w:color w:val="756B5B"/>
                 <w:sz w:val="20"/>
               </w:rPr>
             </w:r>
@@ -1718,7 +1818,7 @@
       </w:tr>
       <w:tr>
         <w:trPr>
-          <w:trHeight w:val="461"/>
+          <w:trHeight w:val="2016"/>
         </w:trPr>
         <w:tc>
           <w:tcPr>
@@ -1731,7 +1831,7 @@
                 <w:b/>
                 <w:sz w:val="20"/>
               </w:rPr>
-              <w:t>Test and question</w:t>
+              <w:t>The question (test, section, number)</w:t>
             </w:r>
           </w:p>
         </w:tc>
@@ -1742,15 +1842,18 @@
           <w:p>
             <w:r>
               <w:rPr>
+                <w:i/>
+                <w:color w:val="756B5B"/>
                 <w:sz w:val="20"/>
               </w:rPr>
+              <w:t>Paste the question here or add a screenshot, so you can redo it later.</w:t>
             </w:r>
           </w:p>
         </w:tc>
       </w:tr>
       <w:tr>
         <w:trPr>
-          <w:trHeight w:val="461"/>
+          <w:trHeight w:val="504"/>
         </w:trPr>
         <w:tc>
           <w:tcPr>
@@ -1774,70 +1877,8 @@
           <w:p>
             <w:r>
               <w:rPr>
-                <w:sz w:val="20"/>
-              </w:rPr>
-            </w:r>
-          </w:p>
-        </w:tc>
-      </w:tr>
-      <w:tr>
-        <w:trPr>
-          <w:trHeight w:val="461"/>
-        </w:trPr>
-        <w:tc>
-          <w:tcPr>
-            <w:tcW w:type="dxa" w:w="2736"/>
-            <w:shd w:val="clear" w:color="auto" w:fill="EDE7D9"/>
-          </w:tcPr>
-          <w:p>
-            <w:r>
-              <w:rPr>
-                <w:b/>
-                <w:sz w:val="20"/>
-              </w:rPr>
-              <w:t>My answer</w:t>
-            </w:r>
-          </w:p>
-        </w:tc>
-        <w:tc>
-          <w:tcPr>
-            <w:tcW w:type="dxa" w:w="6624"/>
-          </w:tcPr>
-          <w:p>
-            <w:r>
-              <w:rPr>
-                <w:sz w:val="20"/>
-              </w:rPr>
-            </w:r>
-          </w:p>
-        </w:tc>
-      </w:tr>
-      <w:tr>
-        <w:trPr>
-          <w:trHeight w:val="461"/>
-        </w:trPr>
-        <w:tc>
-          <w:tcPr>
-            <w:tcW w:type="dxa" w:w="2736"/>
-            <w:shd w:val="clear" w:color="auto" w:fill="EDE7D9"/>
-          </w:tcPr>
-          <w:p>
-            <w:r>
-              <w:rPr>
-                <w:b/>
-                <w:sz w:val="20"/>
-              </w:rPr>
-              <w:t>Right answer</w:t>
-            </w:r>
-          </w:p>
-        </w:tc>
-        <w:tc>
-          <w:tcPr>
-            <w:tcW w:type="dxa" w:w="6624"/>
-          </w:tcPr>
-          <w:p>
-            <w:r>
-              <w:rPr>
+                <w:i/>
+                <w:color w:val="756B5B"/>
                 <w:sz w:val="20"/>
               </w:rPr>
             </w:r>
@@ -1859,7 +1900,7 @@
                 <w:b/>
                 <w:sz w:val="20"/>
               </w:rPr>
-              <w:t>Why I missed it</w:t>
+              <w:t>My answer, and why I picked it</w:t>
             </w:r>
           </w:p>
         </w:tc>
@@ -1870,6 +1911,8 @@
           <w:p>
             <w:r>
               <w:rPr>
+                <w:i/>
+                <w:color w:val="756B5B"/>
                 <w:sz w:val="20"/>
               </w:rPr>
             </w:r>
@@ -1891,7 +1934,7 @@
                 <w:b/>
                 <w:sz w:val="20"/>
               </w:rPr>
-              <w:t>What to look for next time</w:t>
+              <w:t>Right answer, and why it's right</w:t>
             </w:r>
           </w:p>
         </w:tc>
@@ -1902,6 +1945,8 @@
           <w:p>
             <w:r>
               <w:rPr>
+                <w:i/>
+                <w:color w:val="756B5B"/>
                 <w:sz w:val="20"/>
               </w:rPr>
             </w:r>
@@ -1910,7 +1955,7 @@
       </w:tr>
       <w:tr>
         <w:trPr>
-          <w:trHeight w:val="461"/>
+          <w:trHeight w:val="504"/>
         </w:trPr>
         <w:tc>
           <w:tcPr>
@@ -1923,7 +1968,7 @@
                 <w:b/>
                 <w:sz w:val="20"/>
               </w:rPr>
-              <w:t>Reviewed again?</w:t>
+              <w:t>What went wrong</w:t>
             </w:r>
           </w:p>
         </w:tc>
@@ -1934,6 +1979,77 @@
           <w:p>
             <w:r>
               <w:rPr>
+                <w:i/>
+                <w:color w:val="756B5B"/>
+                <w:sz w:val="20"/>
+              </w:rPr>
+              <w:t>Misread it, fell for a trap, missing a concept, or ran out of time?</w:t>
+            </w:r>
+          </w:p>
+        </w:tc>
+      </w:tr>
+      <w:tr>
+        <w:trPr>
+          <w:trHeight w:val="864"/>
+        </w:trPr>
+        <w:tc>
+          <w:tcPr>
+            <w:tcW w:type="dxa" w:w="2736"/>
+            <w:shd w:val="clear" w:color="auto" w:fill="EDE7D9"/>
+          </w:tcPr>
+          <w:p>
+            <w:r>
+              <w:rPr>
+                <w:b/>
+                <w:sz w:val="20"/>
+              </w:rPr>
+              <w:t>How I'll get it right next time</w:t>
+            </w:r>
+          </w:p>
+        </w:tc>
+        <w:tc>
+          <w:tcPr>
+            <w:tcW w:type="dxa" w:w="6624"/>
+          </w:tcPr>
+          <w:p>
+            <w:r>
+              <w:rPr>
+                <w:i/>
+                <w:color w:val="756B5B"/>
+                <w:sz w:val="20"/>
+              </w:rPr>
+            </w:r>
+          </w:p>
+        </w:tc>
+      </w:tr>
+      <w:tr>
+        <w:trPr>
+          <w:trHeight w:val="504"/>
+        </w:trPr>
+        <w:tc>
+          <w:tcPr>
+            <w:tcW w:type="dxa" w:w="2736"/>
+            <w:shd w:val="clear" w:color="auto" w:fill="EDE7D9"/>
+          </w:tcPr>
+          <w:p>
+            <w:r>
+              <w:rPr>
+                <w:b/>
+                <w:sz w:val="20"/>
+              </w:rPr>
+              <w:t>Redid it? (date, right or wrong)</w:t>
+            </w:r>
+          </w:p>
+        </w:tc>
+        <w:tc>
+          <w:tcPr>
+            <w:tcW w:type="dxa" w:w="6624"/>
+          </w:tcPr>
+          <w:p>
+            <w:r>
+              <w:rPr>
+                <w:i/>
+                <w:color w:val="756B5B"/>
                 <w:sz w:val="20"/>
               </w:rPr>
             </w:r>
@@ -1955,7 +2071,7 @@
       </w:tblGrid>
       <w:tr>
         <w:trPr>
-          <w:trHeight w:val="461"/>
+          <w:trHeight w:val="504"/>
         </w:trPr>
         <w:tc>
           <w:tcPr>
@@ -1979,6 +2095,8 @@
           <w:p>
             <w:r>
               <w:rPr>
+                <w:i/>
+                <w:color w:val="756B5B"/>
                 <w:sz w:val="20"/>
               </w:rPr>
             </w:r>
@@ -1987,7 +2105,7 @@
       </w:tr>
       <w:tr>
         <w:trPr>
-          <w:trHeight w:val="461"/>
+          <w:trHeight w:val="2016"/>
         </w:trPr>
         <w:tc>
           <w:tcPr>
@@ -2000,7 +2118,7 @@
                 <w:b/>
                 <w:sz w:val="20"/>
               </w:rPr>
-              <w:t>Test and question</w:t>
+              <w:t>The question (test, section, number)</w:t>
             </w:r>
           </w:p>
         </w:tc>
@@ -2011,15 +2129,18 @@
           <w:p>
             <w:r>
               <w:rPr>
+                <w:i/>
+                <w:color w:val="756B5B"/>
                 <w:sz w:val="20"/>
               </w:rPr>
+              <w:t>Paste the question here or add a screenshot, so you can redo it later.</w:t>
             </w:r>
           </w:p>
         </w:tc>
       </w:tr>
       <w:tr>
         <w:trPr>
-          <w:trHeight w:val="461"/>
+          <w:trHeight w:val="504"/>
         </w:trPr>
         <w:tc>
           <w:tcPr>
@@ -2043,70 +2164,8 @@
           <w:p>
             <w:r>
               <w:rPr>
-                <w:sz w:val="20"/>
-              </w:rPr>
-            </w:r>
-          </w:p>
-        </w:tc>
-      </w:tr>
-      <w:tr>
-        <w:trPr>
-          <w:trHeight w:val="461"/>
-        </w:trPr>
-        <w:tc>
-          <w:tcPr>
-            <w:tcW w:type="dxa" w:w="2736"/>
-            <w:shd w:val="clear" w:color="auto" w:fill="EDE7D9"/>
-          </w:tcPr>
-          <w:p>
-            <w:r>
-              <w:rPr>
-                <w:b/>
-                <w:sz w:val="20"/>
-              </w:rPr>
-              <w:t>My answer</w:t>
-            </w:r>
-          </w:p>
-        </w:tc>
-        <w:tc>
-          <w:tcPr>
-            <w:tcW w:type="dxa" w:w="6624"/>
-          </w:tcPr>
-          <w:p>
-            <w:r>
-              <w:rPr>
-                <w:sz w:val="20"/>
-              </w:rPr>
-            </w:r>
-          </w:p>
-        </w:tc>
-      </w:tr>
-      <w:tr>
-        <w:trPr>
-          <w:trHeight w:val="461"/>
-        </w:trPr>
-        <w:tc>
-          <w:tcPr>
-            <w:tcW w:type="dxa" w:w="2736"/>
-            <w:shd w:val="clear" w:color="auto" w:fill="EDE7D9"/>
-          </w:tcPr>
-          <w:p>
-            <w:r>
-              <w:rPr>
-                <w:b/>
-                <w:sz w:val="20"/>
-              </w:rPr>
-              <w:t>Right answer</w:t>
-            </w:r>
-          </w:p>
-        </w:tc>
-        <w:tc>
-          <w:tcPr>
-            <w:tcW w:type="dxa" w:w="6624"/>
-          </w:tcPr>
-          <w:p>
-            <w:r>
-              <w:rPr>
+                <w:i/>
+                <w:color w:val="756B5B"/>
                 <w:sz w:val="20"/>
               </w:rPr>
             </w:r>
@@ -2128,7 +2187,7 @@
                 <w:b/>
                 <w:sz w:val="20"/>
               </w:rPr>
-              <w:t>Why I missed it</w:t>
+              <w:t>My answer, and why I picked it</w:t>
             </w:r>
           </w:p>
         </w:tc>
@@ -2139,6 +2198,8 @@
           <w:p>
             <w:r>
               <w:rPr>
+                <w:i/>
+                <w:color w:val="756B5B"/>
                 <w:sz w:val="20"/>
               </w:rPr>
             </w:r>
@@ -2160,7 +2221,7 @@
                 <w:b/>
                 <w:sz w:val="20"/>
               </w:rPr>
-              <w:t>What to look for next time</w:t>
+              <w:t>Right answer, and why it's right</w:t>
             </w:r>
           </w:p>
         </w:tc>
@@ -2171,6 +2232,8 @@
           <w:p>
             <w:r>
               <w:rPr>
+                <w:i/>
+                <w:color w:val="756B5B"/>
                 <w:sz w:val="20"/>
               </w:rPr>
             </w:r>
@@ -2179,7 +2242,7 @@
       </w:tr>
       <w:tr>
         <w:trPr>
-          <w:trHeight w:val="461"/>
+          <w:trHeight w:val="504"/>
         </w:trPr>
         <w:tc>
           <w:tcPr>
@@ -2192,7 +2255,7 @@
                 <w:b/>
                 <w:sz w:val="20"/>
               </w:rPr>
-              <w:t>Reviewed again?</w:t>
+              <w:t>What went wrong</w:t>
             </w:r>
           </w:p>
         </w:tc>
@@ -2203,6 +2266,77 @@
           <w:p>
             <w:r>
               <w:rPr>
+                <w:i/>
+                <w:color w:val="756B5B"/>
+                <w:sz w:val="20"/>
+              </w:rPr>
+              <w:t>Misread it, fell for a trap, missing a concept, or ran out of time?</w:t>
+            </w:r>
+          </w:p>
+        </w:tc>
+      </w:tr>
+      <w:tr>
+        <w:trPr>
+          <w:trHeight w:val="864"/>
+        </w:trPr>
+        <w:tc>
+          <w:tcPr>
+            <w:tcW w:type="dxa" w:w="2736"/>
+            <w:shd w:val="clear" w:color="auto" w:fill="EDE7D9"/>
+          </w:tcPr>
+          <w:p>
+            <w:r>
+              <w:rPr>
+                <w:b/>
+                <w:sz w:val="20"/>
+              </w:rPr>
+              <w:t>How I'll get it right next time</w:t>
+            </w:r>
+          </w:p>
+        </w:tc>
+        <w:tc>
+          <w:tcPr>
+            <w:tcW w:type="dxa" w:w="6624"/>
+          </w:tcPr>
+          <w:p>
+            <w:r>
+              <w:rPr>
+                <w:i/>
+                <w:color w:val="756B5B"/>
+                <w:sz w:val="20"/>
+              </w:rPr>
+            </w:r>
+          </w:p>
+        </w:tc>
+      </w:tr>
+      <w:tr>
+        <w:trPr>
+          <w:trHeight w:val="504"/>
+        </w:trPr>
+        <w:tc>
+          <w:tcPr>
+            <w:tcW w:type="dxa" w:w="2736"/>
+            <w:shd w:val="clear" w:color="auto" w:fill="EDE7D9"/>
+          </w:tcPr>
+          <w:p>
+            <w:r>
+              <w:rPr>
+                <w:b/>
+                <w:sz w:val="20"/>
+              </w:rPr>
+              <w:t>Redid it? (date, right or wrong)</w:t>
+            </w:r>
+          </w:p>
+        </w:tc>
+        <w:tc>
+          <w:tcPr>
+            <w:tcW w:type="dxa" w:w="6624"/>
+          </w:tcPr>
+          <w:p>
+            <w:r>
+              <w:rPr>
+                <w:i/>
+                <w:color w:val="756B5B"/>
                 <w:sz w:val="20"/>
               </w:rPr>
             </w:r>
@@ -2224,7 +2358,7 @@
       </w:tblGrid>
       <w:tr>
         <w:trPr>
-          <w:trHeight w:val="461"/>
+          <w:trHeight w:val="504"/>
         </w:trPr>
         <w:tc>
           <w:tcPr>
@@ -2248,6 +2382,8 @@
           <w:p>
             <w:r>
               <w:rPr>
+                <w:i/>
+                <w:color w:val="756B5B"/>
                 <w:sz w:val="20"/>
               </w:rPr>
             </w:r>
@@ -2256,7 +2392,7 @@
       </w:tr>
       <w:tr>
         <w:trPr>
-          <w:trHeight w:val="461"/>
+          <w:trHeight w:val="2016"/>
         </w:trPr>
         <w:tc>
           <w:tcPr>
@@ -2269,7 +2405,7 @@
                 <w:b/>
                 <w:sz w:val="20"/>
               </w:rPr>
-              <w:t>Test and question</w:t>
+              <w:t>The question (test, section, number)</w:t>
             </w:r>
           </w:p>
         </w:tc>
@@ -2280,15 +2416,18 @@
           <w:p>
             <w:r>
               <w:rPr>
+                <w:i/>
+                <w:color w:val="756B5B"/>
                 <w:sz w:val="20"/>
               </w:rPr>
+              <w:t>Paste the question here or add a screenshot, so you can redo it later.</w:t>
             </w:r>
           </w:p>
         </w:tc>
       </w:tr>
       <w:tr>
         <w:trPr>
-          <w:trHeight w:val="461"/>
+          <w:trHeight w:val="504"/>
         </w:trPr>
         <w:tc>
           <w:tcPr>
@@ -2312,70 +2451,8 @@
           <w:p>
             <w:r>
               <w:rPr>
-                <w:sz w:val="20"/>
-              </w:rPr>
-            </w:r>
-          </w:p>
-        </w:tc>
-      </w:tr>
-      <w:tr>
-        <w:trPr>
-          <w:trHeight w:val="461"/>
-        </w:trPr>
-        <w:tc>
-          <w:tcPr>
-            <w:tcW w:type="dxa" w:w="2736"/>
-            <w:shd w:val="clear" w:color="auto" w:fill="EDE7D9"/>
-          </w:tcPr>
-          <w:p>
-            <w:r>
-              <w:rPr>
-                <w:b/>
-                <w:sz w:val="20"/>
-              </w:rPr>
-              <w:t>My answer</w:t>
-            </w:r>
-          </w:p>
-        </w:tc>
-        <w:tc>
-          <w:tcPr>
-            <w:tcW w:type="dxa" w:w="6624"/>
-          </w:tcPr>
-          <w:p>
-            <w:r>
-              <w:rPr>
-                <w:sz w:val="20"/>
-              </w:rPr>
-            </w:r>
-          </w:p>
-        </w:tc>
-      </w:tr>
-      <w:tr>
-        <w:trPr>
-          <w:trHeight w:val="461"/>
-        </w:trPr>
-        <w:tc>
-          <w:tcPr>
-            <w:tcW w:type="dxa" w:w="2736"/>
-            <w:shd w:val="clear" w:color="auto" w:fill="EDE7D9"/>
-          </w:tcPr>
-          <w:p>
-            <w:r>
-              <w:rPr>
-                <w:b/>
-                <w:sz w:val="20"/>
-              </w:rPr>
-              <w:t>Right answer</w:t>
-            </w:r>
-          </w:p>
-        </w:tc>
-        <w:tc>
-          <w:tcPr>
-            <w:tcW w:type="dxa" w:w="6624"/>
-          </w:tcPr>
-          <w:p>
-            <w:r>
-              <w:rPr>
+                <w:i/>
+                <w:color w:val="756B5B"/>
                 <w:sz w:val="20"/>
               </w:rPr>
             </w:r>
@@ -2397,7 +2474,7 @@
                 <w:b/>
                 <w:sz w:val="20"/>
               </w:rPr>
-              <w:t>Why I missed it</w:t>
+              <w:t>My answer, and why I picked it</w:t>
             </w:r>
           </w:p>
         </w:tc>
@@ -2408,6 +2485,8 @@
           <w:p>
             <w:r>
               <w:rPr>
+                <w:i/>
+                <w:color w:val="756B5B"/>
                 <w:sz w:val="20"/>
               </w:rPr>
             </w:r>
@@ -2429,7 +2508,7 @@
                 <w:b/>
                 <w:sz w:val="20"/>
               </w:rPr>
-              <w:t>What to look for next time</w:t>
+              <w:t>Right answer, and why it's right</w:t>
             </w:r>
           </w:p>
         </w:tc>
@@ -2440,6 +2519,8 @@
           <w:p>
             <w:r>
               <w:rPr>
+                <w:i/>
+                <w:color w:val="756B5B"/>
                 <w:sz w:val="20"/>
               </w:rPr>
             </w:r>
@@ -2448,7 +2529,7 @@
       </w:tr>
       <w:tr>
         <w:trPr>
-          <w:trHeight w:val="461"/>
+          <w:trHeight w:val="504"/>
         </w:trPr>
         <w:tc>
           <w:tcPr>
@@ -2461,7 +2542,7 @@
                 <w:b/>
                 <w:sz w:val="20"/>
               </w:rPr>
-              <w:t>Reviewed again?</w:t>
+              <w:t>What went wrong</w:t>
             </w:r>
           </w:p>
         </w:tc>
@@ -2472,6 +2553,77 @@
           <w:p>
             <w:r>
               <w:rPr>
+                <w:i/>
+                <w:color w:val="756B5B"/>
+                <w:sz w:val="20"/>
+              </w:rPr>
+              <w:t>Misread it, fell for a trap, missing a concept, or ran out of time?</w:t>
+            </w:r>
+          </w:p>
+        </w:tc>
+      </w:tr>
+      <w:tr>
+        <w:trPr>
+          <w:trHeight w:val="864"/>
+        </w:trPr>
+        <w:tc>
+          <w:tcPr>
+            <w:tcW w:type="dxa" w:w="2736"/>
+            <w:shd w:val="clear" w:color="auto" w:fill="EDE7D9"/>
+          </w:tcPr>
+          <w:p>
+            <w:r>
+              <w:rPr>
+                <w:b/>
+                <w:sz w:val="20"/>
+              </w:rPr>
+              <w:t>How I'll get it right next time</w:t>
+            </w:r>
+          </w:p>
+        </w:tc>
+        <w:tc>
+          <w:tcPr>
+            <w:tcW w:type="dxa" w:w="6624"/>
+          </w:tcPr>
+          <w:p>
+            <w:r>
+              <w:rPr>
+                <w:i/>
+                <w:color w:val="756B5B"/>
+                <w:sz w:val="20"/>
+              </w:rPr>
+            </w:r>
+          </w:p>
+        </w:tc>
+      </w:tr>
+      <w:tr>
+        <w:trPr>
+          <w:trHeight w:val="504"/>
+        </w:trPr>
+        <w:tc>
+          <w:tcPr>
+            <w:tcW w:type="dxa" w:w="2736"/>
+            <w:shd w:val="clear" w:color="auto" w:fill="EDE7D9"/>
+          </w:tcPr>
+          <w:p>
+            <w:r>
+              <w:rPr>
+                <w:b/>
+                <w:sz w:val="20"/>
+              </w:rPr>
+              <w:t>Redid it? (date, right or wrong)</w:t>
+            </w:r>
+          </w:p>
+        </w:tc>
+        <w:tc>
+          <w:tcPr>
+            <w:tcW w:type="dxa" w:w="6624"/>
+          </w:tcPr>
+          <w:p>
+            <w:r>
+              <w:rPr>
+                <w:i/>
+                <w:color w:val="756B5B"/>
                 <w:sz w:val="20"/>
               </w:rPr>
             </w:r>
@@ -2493,7 +2645,7 @@
       </w:tblGrid>
       <w:tr>
         <w:trPr>
-          <w:trHeight w:val="461"/>
+          <w:trHeight w:val="504"/>
         </w:trPr>
         <w:tc>
           <w:tcPr>
@@ -2517,6 +2669,8 @@
           <w:p>
             <w:r>
               <w:rPr>
+                <w:i/>
+                <w:color w:val="756B5B"/>
                 <w:sz w:val="20"/>
               </w:rPr>
             </w:r>
@@ -2525,7 +2679,7 @@
       </w:tr>
       <w:tr>
         <w:trPr>
-          <w:trHeight w:val="461"/>
+          <w:trHeight w:val="2016"/>
         </w:trPr>
         <w:tc>
           <w:tcPr>
@@ -2538,7 +2692,7 @@
                 <w:b/>
                 <w:sz w:val="20"/>
               </w:rPr>
-              <w:t>Test and question</w:t>
+              <w:t>The question (test, section, number)</w:t>
             </w:r>
           </w:p>
         </w:tc>
@@ -2549,15 +2703,18 @@
           <w:p>
             <w:r>
               <w:rPr>
+                <w:i/>
+                <w:color w:val="756B5B"/>
                 <w:sz w:val="20"/>
               </w:rPr>
+              <w:t>Paste the question here or add a screenshot, so you can redo it later.</w:t>
             </w:r>
           </w:p>
         </w:tc>
       </w:tr>
       <w:tr>
         <w:trPr>
-          <w:trHeight w:val="461"/>
+          <w:trHeight w:val="504"/>
         </w:trPr>
         <w:tc>
           <w:tcPr>
@@ -2581,70 +2738,8 @@
           <w:p>
             <w:r>
               <w:rPr>
-                <w:sz w:val="20"/>
-              </w:rPr>
-            </w:r>
-          </w:p>
-        </w:tc>
-      </w:tr>
-      <w:tr>
-        <w:trPr>
-          <w:trHeight w:val="461"/>
-        </w:trPr>
-        <w:tc>
-          <w:tcPr>
-            <w:tcW w:type="dxa" w:w="2736"/>
-            <w:shd w:val="clear" w:color="auto" w:fill="EDE7D9"/>
-          </w:tcPr>
-          <w:p>
-            <w:r>
-              <w:rPr>
-                <w:b/>
-                <w:sz w:val="20"/>
-              </w:rPr>
-              <w:t>My answer</w:t>
-            </w:r>
-          </w:p>
-        </w:tc>
-        <w:tc>
-          <w:tcPr>
-            <w:tcW w:type="dxa" w:w="6624"/>
-          </w:tcPr>
-          <w:p>
-            <w:r>
-              <w:rPr>
-                <w:sz w:val="20"/>
-              </w:rPr>
-            </w:r>
-          </w:p>
-        </w:tc>
-      </w:tr>
-      <w:tr>
-        <w:trPr>
-          <w:trHeight w:val="461"/>
-        </w:trPr>
-        <w:tc>
-          <w:tcPr>
-            <w:tcW w:type="dxa" w:w="2736"/>
-            <w:shd w:val="clear" w:color="auto" w:fill="EDE7D9"/>
-          </w:tcPr>
-          <w:p>
-            <w:r>
-              <w:rPr>
-                <w:b/>
-                <w:sz w:val="20"/>
-              </w:rPr>
-              <w:t>Right answer</w:t>
-            </w:r>
-          </w:p>
-        </w:tc>
-        <w:tc>
-          <w:tcPr>
-            <w:tcW w:type="dxa" w:w="6624"/>
-          </w:tcPr>
-          <w:p>
-            <w:r>
-              <w:rPr>
+                <w:i/>
+                <w:color w:val="756B5B"/>
                 <w:sz w:val="20"/>
               </w:rPr>
             </w:r>
@@ -2666,7 +2761,7 @@
                 <w:b/>
                 <w:sz w:val="20"/>
               </w:rPr>
-              <w:t>Why I missed it</w:t>
+              <w:t>My answer, and why I picked it</w:t>
             </w:r>
           </w:p>
         </w:tc>
@@ -2677,6 +2772,8 @@
           <w:p>
             <w:r>
               <w:rPr>
+                <w:i/>
+                <w:color w:val="756B5B"/>
                 <w:sz w:val="20"/>
               </w:rPr>
             </w:r>
@@ -2698,7 +2795,7 @@
                 <w:b/>
                 <w:sz w:val="20"/>
               </w:rPr>
-              <w:t>What to look for next time</w:t>
+              <w:t>Right answer, and why it's right</w:t>
             </w:r>
           </w:p>
         </w:tc>
@@ -2709,6 +2806,8 @@
           <w:p>
             <w:r>
               <w:rPr>
+                <w:i/>
+                <w:color w:val="756B5B"/>
                 <w:sz w:val="20"/>
               </w:rPr>
             </w:r>
@@ -2717,7 +2816,7 @@
       </w:tr>
       <w:tr>
         <w:trPr>
-          <w:trHeight w:val="461"/>
+          <w:trHeight w:val="504"/>
         </w:trPr>
         <w:tc>
           <w:tcPr>
@@ -2730,7 +2829,7 @@
                 <w:b/>
                 <w:sz w:val="20"/>
               </w:rPr>
-              <w:t>Reviewed again?</w:t>
+              <w:t>What went wrong</w:t>
             </w:r>
           </w:p>
         </w:tc>
@@ -2741,6 +2840,77 @@
           <w:p>
             <w:r>
               <w:rPr>
+                <w:i/>
+                <w:color w:val="756B5B"/>
+                <w:sz w:val="20"/>
+              </w:rPr>
+              <w:t>Misread it, fell for a trap, missing a concept, or ran out of time?</w:t>
+            </w:r>
+          </w:p>
+        </w:tc>
+      </w:tr>
+      <w:tr>
+        <w:trPr>
+          <w:trHeight w:val="864"/>
+        </w:trPr>
+        <w:tc>
+          <w:tcPr>
+            <w:tcW w:type="dxa" w:w="2736"/>
+            <w:shd w:val="clear" w:color="auto" w:fill="EDE7D9"/>
+          </w:tcPr>
+          <w:p>
+            <w:r>
+              <w:rPr>
+                <w:b/>
+                <w:sz w:val="20"/>
+              </w:rPr>
+              <w:t>How I'll get it right next time</w:t>
+            </w:r>
+          </w:p>
+        </w:tc>
+        <w:tc>
+          <w:tcPr>
+            <w:tcW w:type="dxa" w:w="6624"/>
+          </w:tcPr>
+          <w:p>
+            <w:r>
+              <w:rPr>
+                <w:i/>
+                <w:color w:val="756B5B"/>
+                <w:sz w:val="20"/>
+              </w:rPr>
+            </w:r>
+          </w:p>
+        </w:tc>
+      </w:tr>
+      <w:tr>
+        <w:trPr>
+          <w:trHeight w:val="504"/>
+        </w:trPr>
+        <w:tc>
+          <w:tcPr>
+            <w:tcW w:type="dxa" w:w="2736"/>
+            <w:shd w:val="clear" w:color="auto" w:fill="EDE7D9"/>
+          </w:tcPr>
+          <w:p>
+            <w:r>
+              <w:rPr>
+                <w:b/>
+                <w:sz w:val="20"/>
+              </w:rPr>
+              <w:t>Redid it? (date, right or wrong)</w:t>
+            </w:r>
+          </w:p>
+        </w:tc>
+        <w:tc>
+          <w:tcPr>
+            <w:tcW w:type="dxa" w:w="6624"/>
+          </w:tcPr>
+          <w:p>
+            <w:r>
+              <w:rPr>
+                <w:i/>
+                <w:color w:val="756B5B"/>
                 <w:sz w:val="20"/>
               </w:rPr>
             </w:r>
@@ -2762,7 +2932,7 @@
       </w:tblGrid>
       <w:tr>
         <w:trPr>
-          <w:trHeight w:val="461"/>
+          <w:trHeight w:val="504"/>
         </w:trPr>
         <w:tc>
           <w:tcPr>
@@ -2786,6 +2956,8 @@
           <w:p>
             <w:r>
               <w:rPr>
+                <w:i/>
+                <w:color w:val="756B5B"/>
                 <w:sz w:val="20"/>
               </w:rPr>
             </w:r>
@@ -2794,7 +2966,7 @@
       </w:tr>
       <w:tr>
         <w:trPr>
-          <w:trHeight w:val="461"/>
+          <w:trHeight w:val="2016"/>
         </w:trPr>
         <w:tc>
           <w:tcPr>
@@ -2807,7 +2979,7 @@
                 <w:b/>
                 <w:sz w:val="20"/>
               </w:rPr>
-              <w:t>Test and question</w:t>
+              <w:t>The question (test, section, number)</w:t>
             </w:r>
           </w:p>
         </w:tc>
@@ -2818,15 +2990,18 @@
           <w:p>
             <w:r>
               <w:rPr>
+                <w:i/>
+                <w:color w:val="756B5B"/>
                 <w:sz w:val="20"/>
               </w:rPr>
+              <w:t>Paste the question here or add a screenshot, so you can redo it later.</w:t>
             </w:r>
           </w:p>
         </w:tc>
       </w:tr>
       <w:tr>
         <w:trPr>
-          <w:trHeight w:val="461"/>
+          <w:trHeight w:val="504"/>
         </w:trPr>
         <w:tc>
           <w:tcPr>
@@ -2850,70 +3025,8 @@
           <w:p>
             <w:r>
               <w:rPr>
-                <w:sz w:val="20"/>
-              </w:rPr>
-            </w:r>
-          </w:p>
-        </w:tc>
-      </w:tr>
-      <w:tr>
-        <w:trPr>
-          <w:trHeight w:val="461"/>
-        </w:trPr>
-        <w:tc>
-          <w:tcPr>
-            <w:tcW w:type="dxa" w:w="2736"/>
-            <w:shd w:val="clear" w:color="auto" w:fill="EDE7D9"/>
-          </w:tcPr>
-          <w:p>
-            <w:r>
-              <w:rPr>
-                <w:b/>
-                <w:sz w:val="20"/>
-              </w:rPr>
-              <w:t>My answer</w:t>
-            </w:r>
-          </w:p>
-        </w:tc>
-        <w:tc>
-          <w:tcPr>
-            <w:tcW w:type="dxa" w:w="6624"/>
-          </w:tcPr>
-          <w:p>
-            <w:r>
-              <w:rPr>
-                <w:sz w:val="20"/>
-              </w:rPr>
-            </w:r>
-          </w:p>
-        </w:tc>
-      </w:tr>
-      <w:tr>
-        <w:trPr>
-          <w:trHeight w:val="461"/>
-        </w:trPr>
-        <w:tc>
-          <w:tcPr>
-            <w:tcW w:type="dxa" w:w="2736"/>
-            <w:shd w:val="clear" w:color="auto" w:fill="EDE7D9"/>
-          </w:tcPr>
-          <w:p>
-            <w:r>
-              <w:rPr>
-                <w:b/>
-                <w:sz w:val="20"/>
-              </w:rPr>
-              <w:t>Right answer</w:t>
-            </w:r>
-          </w:p>
-        </w:tc>
-        <w:tc>
-          <w:tcPr>
-            <w:tcW w:type="dxa" w:w="6624"/>
-          </w:tcPr>
-          <w:p>
-            <w:r>
-              <w:rPr>
+                <w:i/>
+                <w:color w:val="756B5B"/>
                 <w:sz w:val="20"/>
               </w:rPr>
             </w:r>
@@ -2935,7 +3048,7 @@
                 <w:b/>
                 <w:sz w:val="20"/>
               </w:rPr>
-              <w:t>Why I missed it</w:t>
+              <w:t>My answer, and why I picked it</w:t>
             </w:r>
           </w:p>
         </w:tc>
@@ -2946,6 +3059,8 @@
           <w:p>
             <w:r>
               <w:rPr>
+                <w:i/>
+                <w:color w:val="756B5B"/>
                 <w:sz w:val="20"/>
               </w:rPr>
             </w:r>
@@ -2967,7 +3082,7 @@
                 <w:b/>
                 <w:sz w:val="20"/>
               </w:rPr>
-              <w:t>What to look for next time</w:t>
+              <w:t>Right answer, and why it's right</w:t>
             </w:r>
           </w:p>
         </w:tc>
@@ -2978,6 +3093,8 @@
           <w:p>
             <w:r>
               <w:rPr>
+                <w:i/>
+                <w:color w:val="756B5B"/>
                 <w:sz w:val="20"/>
               </w:rPr>
             </w:r>
@@ -2986,7 +3103,7 @@
       </w:tr>
       <w:tr>
         <w:trPr>
-          <w:trHeight w:val="461"/>
+          <w:trHeight w:val="504"/>
         </w:trPr>
         <w:tc>
           <w:tcPr>
@@ -2999,7 +3116,7 @@
                 <w:b/>
                 <w:sz w:val="20"/>
               </w:rPr>
-              <w:t>Reviewed again?</w:t>
+              <w:t>What went wrong</w:t>
             </w:r>
           </w:p>
         </w:tc>
@@ -3010,6 +3127,77 @@
           <w:p>
             <w:r>
               <w:rPr>
+                <w:i/>
+                <w:color w:val="756B5B"/>
+                <w:sz w:val="20"/>
+              </w:rPr>
+              <w:t>Misread it, fell for a trap, missing a concept, or ran out of time?</w:t>
+            </w:r>
+          </w:p>
+        </w:tc>
+      </w:tr>
+      <w:tr>
+        <w:trPr>
+          <w:trHeight w:val="864"/>
+        </w:trPr>
+        <w:tc>
+          <w:tcPr>
+            <w:tcW w:type="dxa" w:w="2736"/>
+            <w:shd w:val="clear" w:color="auto" w:fill="EDE7D9"/>
+          </w:tcPr>
+          <w:p>
+            <w:r>
+              <w:rPr>
+                <w:b/>
+                <w:sz w:val="20"/>
+              </w:rPr>
+              <w:t>How I'll get it right next time</w:t>
+            </w:r>
+          </w:p>
+        </w:tc>
+        <w:tc>
+          <w:tcPr>
+            <w:tcW w:type="dxa" w:w="6624"/>
+          </w:tcPr>
+          <w:p>
+            <w:r>
+              <w:rPr>
+                <w:i/>
+                <w:color w:val="756B5B"/>
+                <w:sz w:val="20"/>
+              </w:rPr>
+            </w:r>
+          </w:p>
+        </w:tc>
+      </w:tr>
+      <w:tr>
+        <w:trPr>
+          <w:trHeight w:val="504"/>
+        </w:trPr>
+        <w:tc>
+          <w:tcPr>
+            <w:tcW w:type="dxa" w:w="2736"/>
+            <w:shd w:val="clear" w:color="auto" w:fill="EDE7D9"/>
+          </w:tcPr>
+          <w:p>
+            <w:r>
+              <w:rPr>
+                <w:b/>
+                <w:sz w:val="20"/>
+              </w:rPr>
+              <w:t>Redid it? (date, right or wrong)</w:t>
+            </w:r>
+          </w:p>
+        </w:tc>
+        <w:tc>
+          <w:tcPr>
+            <w:tcW w:type="dxa" w:w="6624"/>
+          </w:tcPr>
+          <w:p>
+            <w:r>
+              <w:rPr>
+                <w:i/>
+                <w:color w:val="756B5B"/>
                 <w:sz w:val="20"/>
               </w:rPr>
             </w:r>

</xml_diff>